<commit_message>
2026-03-10 NHL API Reference, GamePredictions
</commit_message>
<xml_diff>
--- a/Python/Resume Building/2026/Jobs applied to 20260306.docx
+++ b/Python/Resume Building/2026/Jobs applied to 20260306.docx
@@ -39,19 +39,11 @@
         </w:rPr>
         <w:t xml:space="preserve"> Developer – </w:t>
       </w:r>
-      <w:proofErr w:type="spellStart"/>
       <w:r>
         <w:rPr>
           <w:lang w:val="en-US"/>
         </w:rPr>
-        <w:t>BuildCode</w:t>
-      </w:r>
-      <w:proofErr w:type="spellEnd"/>
-      <w:r>
-        <w:rPr>
-          <w:lang w:val="en-US"/>
-        </w:rPr>
-        <w:t xml:space="preserve"> Inc.</w:t>
+        <w:t>BuildCode Inc.</w:t>
       </w:r>
       <w:r>
         <w:rPr>
@@ -66,7 +58,16 @@
         <w:t>Remote</w:t>
       </w:r>
     </w:p>
-    <w:p/>
+    <w:p>
+      <w:r>
+        <w:t>2026-03-09 – Software Developer – Helm Operations Software Inc – Remote</w:t>
+      </w:r>
+    </w:p>
+    <w:p>
+      <w:r>
+        <w:t>2026-03-09 – Automation Engineer – Ace Software Consulting Inc. - Remote</w:t>
+      </w:r>
+    </w:p>
     <w:sectPr>
       <w:pgSz w:w="12240" w:h="15840"/>
       <w:pgMar w:top="1440" w:right="1440" w:bottom="1440" w:left="1440" w:header="708" w:footer="708" w:gutter="0"/>

</xml_diff>

<commit_message>
2026-03-16 GamePredictions, New Dashboard, New Predctions Analysis
</commit_message>
<xml_diff>
--- a/Python/Resume Building/2026/Jobs applied to 20260306.docx
+++ b/Python/Resume Building/2026/Jobs applied to 20260306.docx
@@ -13,21 +13,7 @@
         <w:rPr>
           <w:lang w:val="en-US"/>
         </w:rPr>
-        <w:t xml:space="preserve">2026-03-06 – Full Stack Developer – </w:t>
-      </w:r>
-      <w:proofErr w:type="spellStart"/>
-      <w:r>
-        <w:rPr>
-          <w:lang w:val="en-US"/>
-        </w:rPr>
-        <w:t>BuildCode</w:t>
-      </w:r>
-      <w:proofErr w:type="spellEnd"/>
-      <w:r>
-        <w:rPr>
-          <w:lang w:val="en-US"/>
-        </w:rPr>
-        <w:t xml:space="preserve"> Inc. – Remote</w:t>
+        <w:t>2026-03-06 – Full Stack Developer – BuildCode Inc. – Remote</w:t>
       </w:r>
     </w:p>
     <w:p>
@@ -48,7 +34,18 @@
     </w:p>
     <w:p>
       <w:r>
-        <w:t>2026-03-10 – Online Data Analyst – Telus AI - Remote</w:t>
+        <w:t xml:space="preserve">2026-03-10 – Online Data Analyst – Telus AI </w:t>
+      </w:r>
+      <w:r>
+        <w:t>–</w:t>
+      </w:r>
+      <w:r>
+        <w:t xml:space="preserve"> Remote</w:t>
+      </w:r>
+    </w:p>
+    <w:p>
+      <w:r>
+        <w:t>2026-03-11 – Access Database Developer – Access DB Experts - Remote</w:t>
       </w:r>
     </w:p>
     <w:sectPr>

</xml_diff>